<commit_message>
DMA, AHB, AHB2APB verification and the Cadence (irun/IMC/NCLaunch) coverage flow for core, DSU, DMA and AHB
Cadence scripts: flow/cov/<blk>_cadence.sh, <blk>_ncl.tcl, <blk>_report.tcl, <blk>.ccf, <blk>_exclusions.tcl (generated by tools/cov/gen_cadence_cov.py). DMA/AHB/bridge benches, properties, mutants and generators; RTL: AUD-13 (dma_apb_slave), APB-2 (ahb2apb_bridge), AHB-6 comment. Raw logs are not included.

Co-Authored-By: Claude Sonnet 5.5 <noreply@anthropic.com>
</commit_message>
<xml_diff>
--- a/Design_Docs/GARUDA-AHB-SPEC-001.docx
+++ b/Design_Docs/GARUDA-AHB-SPEC-001.docx
@@ -2,7 +2,7 @@
 <file path=word/document.xml><?xml version="1.0" encoding="utf-8"?>
 <w:document xmlns:w="http://schemas.openxmlformats.org/wordprocessingml/2006/main" xmlns:m="http://schemas.openxmlformats.org/officeDocument/2006/math" xmlns:r="http://schemas.openxmlformats.org/officeDocument/2006/relationships" xmlns:o="urn:schemas-microsoft-com:office:office" xmlns:v="urn:schemas-microsoft-com:vml" xmlns:w10="urn:schemas-microsoft-com:office:word" xmlns:a="http://schemas.openxmlformats.org/drawingml/2006/main" xmlns:pic="http://schemas.openxmlformats.org/drawingml/2006/picture" xmlns:wp="http://schemas.openxmlformats.org/drawingml/2006/wordprocessingDrawing">
   <w:body>
-    <w:bookmarkStart w:id="55" w:name="Xf3a5531c523cef9f34a6f8a5c700408d82a2c83"/>
+    <w:bookmarkStart w:id="55" w:name="X1d124a4e01728a42ff3a5039697764b244460f3"/>
     <w:p>
       <w:pPr>
         <w:pStyle w:val="Heading1"/>
@@ -11,7 +11,7 @@
         <w:t xml:space="preserve">GARUDA AHB-Lite Interconnect — Design Specification</w:t>
       </w:r>
     </w:p>
-    <w:bookmarkStart w:id="20" w:name="identity"/>
+    <w:bookmarkStart w:id="20" w:name="Xee8498aa8c87dd42cd65edb36b9d23d240ee498"/>
     <w:p>
       <w:pPr>
         <w:pStyle w:val="Heading2"/>
@@ -253,7 +253,7 @@
       </w:tr>
     </w:tbl>
     <w:bookmarkEnd w:id="20"/>
-    <w:bookmarkStart w:id="21" w:name="revision-history"/>
+    <w:bookmarkStart w:id="21" w:name="Xb1b59fb676dd662d835fe73b7735d76294c3e07"/>
     <w:p>
       <w:pPr>
         <w:pStyle w:val="Heading2"/>
@@ -265,7 +265,7 @@
     <w:tbl>
       <w:tblPr>
         <w:tblStyle w:val="Table"/>
-        <w:tblW w:type="pct" w:w="5000"/>
+        <w:tblW w:type="auto" w:w="0"/>
         <w:tblLook w:firstRow="1" w:lastRow="0" w:firstColumn="0" w:lastColumn="0" w:noHBand="0" w:noVBand="0" w:val="0020"/>
         <w:jc w:val="start"/>
       </w:tblPr>
@@ -454,9 +454,47 @@
           </w:p>
         </w:tc>
       </w:tr>
+      <w:tr>
+        <w:tc>
+          <w:tcPr/>
+          <w:p>
+            <w:pPr>
+              <w:pStyle w:val="Compact"/>
+              <w:jc w:val="left"/>
+            </w:pPr>
+            <w:r>
+              <w:t xml:space="preserve">4.0a</w:t>
+            </w:r>
+          </w:p>
+        </w:tc>
+        <w:tc>
+          <w:tcPr/>
+          <w:p>
+            <w:pPr>
+              <w:pStyle w:val="Compact"/>
+              <w:jc w:val="left"/>
+            </w:pPr>
+            <w:r>
+              <w:t xml:space="preserve">Note under §2: the DMA's R-9 restriction lives in the DMA, not in the fabric (Track A task 0.7, 2026-10-12; no change to the interconnect).</w:t>
+            </w:r>
+          </w:p>
+        </w:tc>
+        <w:tc>
+          <w:tcPr/>
+          <w:p>
+            <w:pPr>
+              <w:pStyle w:val="Compact"/>
+              <w:jc w:val="left"/>
+            </w:pPr>
+            <w:r>
+              <w:t xml:space="preserve">AUD-12</w:t>
+            </w:r>
+          </w:p>
+        </w:tc>
+      </w:tr>
     </w:tbl>
     <w:bookmarkEnd w:id="21"/>
-    <w:bookmarkStart w:id="22" w:name="normative-references"/>
+    <w:bookmarkStart w:id="22" w:name="X7d72cd5e2ccd5281d575eeaae2e7a05cbe542e8"/>
     <w:p>
       <w:pPr>
         <w:pStyle w:val="Heading2"/>
@@ -590,7 +628,7 @@
       </w:r>
     </w:p>
     <w:bookmarkEnd w:id="22"/>
-    <w:bookmarkStart w:id="26" w:name="purpose-and-scope"/>
+    <w:bookmarkStart w:id="26" w:name="X4666c8db187a468bd7c4d1efd69e1ca31a62544"/>
     <w:p>
       <w:pPr>
         <w:pStyle w:val="Heading2"/>
@@ -599,7 +637,7 @@
         <w:t xml:space="preserve">1 Purpose and scope</w:t>
       </w:r>
     </w:p>
-    <w:bookmarkStart w:id="23" w:name="in-scope"/>
+    <w:bookmarkStart w:id="23" w:name="X982033b5eecaea9e0967e965864423587568394"/>
     <w:p>
       <w:pPr>
         <w:pStyle w:val="Heading3"/>
@@ -623,7 +661,7 @@
       </w:r>
     </w:p>
     <w:bookmarkEnd w:id="23"/>
-    <w:bookmarkStart w:id="24" w:name="out-of-scope"/>
+    <w:bookmarkStart w:id="24" w:name="X132851fb01253333d36643f8ae8b0fecae9f6a0"/>
     <w:p>
       <w:pPr>
         <w:pStyle w:val="Heading3"/>
@@ -678,7 +716,7 @@
       </w:r>
     </w:p>
     <w:bookmarkEnd w:id="24"/>
-    <w:bookmarkStart w:id="25" w:name="why-rev-4.0-goes-backwards"/>
+    <w:bookmarkStart w:id="25" w:name="X2a988fb775ea1e9c388fc67d92735012a534e9f"/>
     <w:p>
       <w:pPr>
         <w:pStyle w:val="Heading3"/>
@@ -765,25 +803,7 @@
         <w:t xml:space="preserve"> </w:t>
       </w:r>
       <w:r>
-        <w:t xml:space="preserve">not reach ISRAM or Boot ROM —</w:t>
-      </w:r>
-      <w:r>
-        <w:t xml:space="preserve"> </w:t>
-      </w:r>
-      <w:r>
-        <w:t xml:space="preserve">“</w:t>
-      </w:r>
-      <w:r>
-        <w:t xml:space="preserve">no wire exists in the netlist.</w:t>
-      </w:r>
-      <w:r>
-        <w:t xml:space="preserve">”</w:t>
-      </w:r>
-      <w:r>
-        <w:t xml:space="preserve"> </w:t>
-      </w:r>
-      <w:r>
-        <w:t xml:space="preserve">That restriction silently</w:t>
+        <w:t xml:space="preserve">not reach ISRAM or Boot ROM — "no wire exists in the netlist." That restriction silently</w:t>
       </w:r>
       <w:r>
         <w:t xml:space="preserve"> </w:t>
@@ -795,7 +815,7 @@
     <w:tbl>
       <w:tblPr>
         <w:tblStyle w:val="Table"/>
-        <w:tblW w:type="pct" w:w="5000"/>
+        <w:tblW w:type="auto" w:w="0"/>
         <w:tblLook w:firstRow="1" w:lastRow="0" w:firstColumn="0" w:lastColumn="0" w:noHBand="0" w:noVBand="0" w:val="0020"/>
         <w:jc w:val="start"/>
       </w:tblPr>
@@ -989,7 +1009,7 @@
     </w:p>
     <w:bookmarkEnd w:id="25"/>
     <w:bookmarkEnd w:id="26"/>
-    <w:bookmarkStart w:id="27" w:name="requirements"/>
+    <w:bookmarkStart w:id="27" w:name="X7ac32b3a81e4212c01abd06ff86531ccba71244"/>
     <w:p>
       <w:pPr>
         <w:pStyle w:val="Heading2"/>
@@ -1001,7 +1021,7 @@
     <w:tbl>
       <w:tblPr>
         <w:tblStyle w:val="Table"/>
-        <w:tblW w:type="pct" w:w="5000"/>
+        <w:tblW w:type="auto" w:w="0"/>
         <w:tblLook w:firstRow="1" w:lastRow="0" w:firstColumn="0" w:lastColumn="0" w:noHBand="0" w:noVBand="0" w:val="0020"/>
         <w:jc w:val="start"/>
       </w:tblPr>
@@ -1376,7 +1396,7 @@
               <w:jc w:val="left"/>
             </w:pPr>
             <w:r>
-              <w:t xml:space="preserve">A master’s burst shall not be corrupted by losing arbitration mid-burst.</w:t>
+              <w:t xml:space="preserve">A master's burst shall not be corrupted by losing arbitration mid-burst.</w:t>
             </w:r>
           </w:p>
         </w:tc>
@@ -1395,6 +1415,68 @@
       </w:tr>
     </w:tbl>
     <w:p>
+      <w:pPr>
+        <w:pStyle w:val="BodyText"/>
+      </w:pPr>
+      <w:r>
+        <w:rPr>
+          <w:iCs/>
+          <w:i/>
+        </w:rPr>
+        <w:t xml:space="preserve">(Note, 2026-10-12, AUD-12 item 1: R-4 lets the DMA (M3) address ISRAM and Boot ROM through the</w:t>
+      </w:r>
+      <w:r>
+        <w:rPr>
+          <w:iCs/>
+          <w:i/>
+        </w:rPr>
+        <w:t xml:space="preserve"> </w:t>
+      </w:r>
+      <w:r>
+        <w:rPr>
+          <w:iCs/>
+          <w:i/>
+        </w:rPr>
+        <w:t xml:space="preserve">fabric. The DMA itself refuses such addresses (</w:t>
+      </w:r>
+      <w:r>
+        <w:rPr>
+          <w:rStyle w:val="VerbatimChar"/>
+          <w:iCs/>
+          <w:i/>
+        </w:rPr>
+        <w:t xml:space="preserve">GARUDA-DMA-SPEC-001</w:t>
+      </w:r>
+      <w:r>
+        <w:rPr>
+          <w:iCs/>
+          <w:i/>
+        </w:rPr>
+        <w:t xml:space="preserve"> </w:t>
+      </w:r>
+      <w:r>
+        <w:rPr>
+          <w:iCs/>
+          <w:i/>
+        </w:rPr>
+        <w:t xml:space="preserve">R-9 and [N-7.20],</w:t>
+      </w:r>
+      <w:r>
+        <w:rPr>
+          <w:iCs/>
+          <w:i/>
+        </w:rPr>
+        <w:t xml:space="preserve"> </w:t>
+      </w:r>
+      <w:r>
+        <w:rPr>
+          <w:iCs/>
+          <w:i/>
+        </w:rPr>
+        <w:t xml:space="preserve">DECISIONS D-16), so the restriction lives in the master, not in the interconnect.)</w:t>
+      </w:r>
+    </w:p>
+    <w:p>
       <w:r>
         <w:pict>
           <v:rect style="width:0;height:1.5pt" o:hralign="center" o:hrstd="t" o:hr="t"/>
@@ -1402,7 +1484,7 @@
       </w:r>
     </w:p>
     <w:bookmarkEnd w:id="27"/>
-    <w:bookmarkStart w:id="28" w:name="block-diagram"/>
+    <w:bookmarkStart w:id="28" w:name="X1a7d97650db9c8935e98f54c49fc0d1c2422484"/>
     <w:p>
       <w:pPr>
         <w:pStyle w:val="Heading2"/>
@@ -1736,7 +1818,7 @@
       </w:r>
     </w:p>
     <w:bookmarkEnd w:id="28"/>
-    <w:bookmarkStart w:id="29" w:name="sub-block-inventory"/>
+    <w:bookmarkStart w:id="29" w:name="Xebf6fc5ba8dcde2af88cf555221c19004ccfe53"/>
     <w:p>
       <w:pPr>
         <w:pStyle w:val="Heading2"/>
@@ -1748,7 +1830,7 @@
     <w:tbl>
       <w:tblPr>
         <w:tblStyle w:val="Table"/>
-        <w:tblW w:type="pct" w:w="5000"/>
+        <w:tblW w:type="auto" w:w="0"/>
         <w:tblLook w:firstRow="1" w:lastRow="0" w:firstColumn="0" w:lastColumn="0" w:noHBand="0" w:noVBand="0" w:val="0020"/>
         <w:jc w:val="start"/>
       </w:tblPr>
@@ -2169,7 +2251,7 @@
       </w:r>
     </w:p>
     <w:bookmarkEnd w:id="29"/>
-    <w:bookmarkStart w:id="33" w:name="interfaces"/>
+    <w:bookmarkStart w:id="33" w:name="X1571269831bc8f18807262f96c888bdf754311e"/>
     <w:p>
       <w:pPr>
         <w:pStyle w:val="Heading2"/>
@@ -2178,7 +2260,7 @@
         <w:t xml:space="preserve">5 Interfaces</w:t>
       </w:r>
     </w:p>
-    <w:bookmarkStart w:id="30" w:name="per-master-interface-4"/>
+    <w:bookmarkStart w:id="30" w:name="X3bd137427acbcf620483206575595e3bc930474"/>
     <w:p>
       <w:pPr>
         <w:pStyle w:val="Heading3"/>
@@ -2190,7 +2272,7 @@
     <w:tbl>
       <w:tblPr>
         <w:tblStyle w:val="Table"/>
-        <w:tblW w:type="pct" w:w="5000"/>
+        <w:tblW w:type="auto" w:w="0"/>
         <w:tblLook w:firstRow="1" w:lastRow="0" w:firstColumn="0" w:lastColumn="0" w:noHBand="0" w:noVBand="0" w:val="0020"/>
         <w:jc w:val="start"/>
       </w:tblPr>
@@ -2866,7 +2948,7 @@
       </w:r>
     </w:p>
     <w:bookmarkEnd w:id="30"/>
-    <w:bookmarkStart w:id="31" w:name="per-slave-interface-4"/>
+    <w:bookmarkStart w:id="31" w:name="Xc1e0cda6f4257969840443f0acc30626bf62d6a"/>
     <w:p>
       <w:pPr>
         <w:pStyle w:val="Heading3"/>
@@ -2878,7 +2960,7 @@
     <w:tbl>
       <w:tblPr>
         <w:tblStyle w:val="Table"/>
-        <w:tblW w:type="pct" w:w="5000"/>
+        <w:tblW w:type="auto" w:w="0"/>
         <w:tblLook w:firstRow="1" w:lastRow="0" w:firstColumn="0" w:lastColumn="0" w:noHBand="0" w:noVBand="0" w:val="0020"/>
         <w:jc w:val="start"/>
       </w:tblPr>
@@ -3155,7 +3237,7 @@
               <w:jc w:val="left"/>
             </w:pPr>
             <w:r>
-              <w:t xml:space="preserve">To ISRAM only. See [N-7.10].</w:t>
+              <w:t xml:space="preserve">To ISRAM only. See [N-7.14].</w:t>
             </w:r>
           </w:p>
         </w:tc>
@@ -3309,7 +3391,7 @@
       </w:tr>
     </w:tbl>
     <w:bookmarkEnd w:id="31"/>
-    <w:bookmarkStart w:id="32" w:name="signals-not-implemented"/>
+    <w:bookmarkStart w:id="32" w:name="X339f1f8c71a749148fadefc78771b4d072571ff"/>
     <w:p>
       <w:pPr>
         <w:pStyle w:val="Heading3"/>
@@ -3417,7 +3499,7 @@
         <w:t xml:space="preserve"> </w:t>
       </w:r>
       <w:r>
-        <w:t xml:space="preserve">single-hart with no atomics (no A extension), and the DMA’s transfers are independent</w:t>
+        <w:t xml:space="preserve">single-hart with no atomics (no A extension), and the DMA's transfers are independent</w:t>
       </w:r>
       <w:r>
         <w:t xml:space="preserve"> </w:t>
@@ -3480,7 +3562,7 @@
     </w:p>
     <w:bookmarkEnd w:id="32"/>
     <w:bookmarkEnd w:id="33"/>
-    <w:bookmarkStart w:id="34" w:name="register-map"/>
+    <w:bookmarkStart w:id="34" w:name="X993360f134ac5f4020b563a2e981249bc87d383"/>
     <w:p>
       <w:pPr>
         <w:pStyle w:val="Heading2"/>
@@ -3533,7 +3615,7 @@
       </w:r>
     </w:p>
     <w:bookmarkEnd w:id="34"/>
-    <w:bookmarkStart w:id="42" w:name="functional-description"/>
+    <w:bookmarkStart w:id="42" w:name="X43b40caff11aa9e2dfba708922741378dc13e92"/>
     <w:p>
       <w:pPr>
         <w:pStyle w:val="Heading2"/>
@@ -3542,7 +3624,7 @@
         <w:t xml:space="preserve">7 Functional description</w:t>
       </w:r>
     </w:p>
-    <w:bookmarkStart w:id="35" w:name="topology"/>
+    <w:bookmarkStart w:id="35" w:name="Xb762d2afbd837307a58a4710d60cd02136ab466"/>
     <w:p>
       <w:pPr>
         <w:pStyle w:val="Heading3"/>
@@ -3627,7 +3709,7 @@
       </w:r>
     </w:p>
     <w:bookmarkEnd w:id="35"/>
-    <w:bookmarkStart w:id="36" w:name="arbitration"/>
+    <w:bookmarkStart w:id="36" w:name="X13fdfd2237080636ca4fd7c2f9ead5398efcef3"/>
     <w:p>
       <w:pPr>
         <w:pStyle w:val="Heading3"/>
@@ -3678,7 +3760,7 @@
     <w:tbl>
       <w:tblPr>
         <w:tblStyle w:val="Table"/>
-        <w:tblW w:type="pct" w:w="5000"/>
+        <w:tblW w:type="auto" w:w="0"/>
         <w:tblLook w:firstRow="1" w:lastRow="0" w:firstColumn="0" w:lastColumn="0" w:noHBand="0" w:noVBand="0" w:val="0020"/>
         <w:jc w:val="start"/>
       </w:tblPr>
@@ -3998,13 +4080,13 @@
         <w:t xml:space="preserve"> </w:t>
       </w:r>
       <w:r>
-        <w:t xml:space="preserve">Once a transfer’s address</w:t>
-      </w:r>
-      <w:r>
-        <w:t xml:space="preserve"> </w:t>
-      </w:r>
-      <w:r>
-        <w:t xml:space="preserve">phase has been accepted, the grant cannot move until that transfer’s data phase completes.</w:t>
+        <w:t xml:space="preserve">Once a transfer's address</w:t>
+      </w:r>
+      <w:r>
+        <w:t xml:space="preserve"> </w:t>
+      </w:r>
+      <w:r>
+        <w:t xml:space="preserve">phase has been accepted, the grant cannot move until that transfer's data phase completes.</w:t>
       </w:r>
       <w:r>
         <w:t xml:space="preserve"> </w:t>
@@ -4046,7 +4128,7 @@
         <w:t xml:space="preserve"> </w:t>
       </w:r>
       <w:r>
-        <w:t xml:space="preserve">The interposed beat completes, then M0’s burst resumes with</w:t>
+        <w:t xml:space="preserve">The interposed beat completes, then M0's burst resumes with</w:t>
       </w:r>
       <w:r>
         <w:t xml:space="preserve"> </w:t>
@@ -4079,7 +4161,7 @@
         <w:t xml:space="preserve">SEQ</w:t>
       </w:r>
       <w:r>
-        <w:t xml:space="preserve">. M0’s prefetch buffer treats a NONSEQ restart as a normal fetch, so</w:t>
+        <w:t xml:space="preserve">. M0's prefetch buffer treats a NONSEQ restart as a normal fetch, so</w:t>
       </w:r>
       <w:r>
         <w:t xml:space="preserve"> </w:t>
@@ -4131,7 +4213,7 @@
       </w:r>
     </w:p>
     <w:bookmarkEnd w:id="36"/>
-    <w:bookmarkStart w:id="37" w:name="reachability-normative"/>
+    <w:bookmarkStart w:id="37" w:name="X58e58b544020298f1942449bda585d06a054e3b"/>
     <w:p>
       <w:pPr>
         <w:pStyle w:val="Heading3"/>
@@ -4528,7 +4610,7 @@
         <w:t xml:space="preserve"> </w:t>
       </w:r>
       <w:r>
-        <w:t xml:space="preserve">decode, (b) the ISRAM write lock, and (c) a slave’s own rejection of an operation it does not</w:t>
+        <w:t xml:space="preserve">decode, (b) the ISRAM write lock, and (c) a slave's own rejection of an operation it does not</w:t>
       </w:r>
       <w:r>
         <w:t xml:space="preserve"> </w:t>
@@ -4594,19 +4676,25 @@
         <w:t xml:space="preserve"> </w:t>
       </w:r>
       <w:r>
-        <w:t xml:space="preserve">M3 (DMA) has no Boot ROM path because nothing requires it: the bootloader is</w:t>
-      </w:r>
-      <w:r>
-        <w:t xml:space="preserve"> </w:t>
-      </w:r>
-      <w:r>
-        <w:t xml:space="preserve">polled PIO (ADR-0015) and no runtime function reads the ROM. This is an omission of an</w:t>
-      </w:r>
-      <w:r>
-        <w:t xml:space="preserve"> </w:t>
-      </w:r>
-      <w:r>
-        <w:t xml:space="preserve">unused path, not an access-control mechanism, and it is recorded in</w:t>
+        <w:t xml:space="preserve">M3 (DMA) does not address the Boot ROM because nothing requires it: the</w:t>
+      </w:r>
+      <w:r>
+        <w:t xml:space="preserve"> </w:t>
+      </w:r>
+      <w:r>
+        <w:t xml:space="preserve">bootloader is polled PIO (ADR-0015) and no runtime function reads the ROM. The fabric path</w:t>
+      </w:r>
+      <w:r>
+        <w:t xml:space="preserve"> </w:t>
+      </w:r>
+      <w:r>
+        <w:t xml:space="preserve">exists (one shared layer, [N-7.9]); the DMA's own address check (GARUDA-DMA-SPEC-001 R-9)</w:t>
+      </w:r>
+      <w:r>
+        <w:t xml:space="preserve"> </w:t>
+      </w:r>
+      <w:r>
+        <w:t xml:space="preserve">refuses region 0x1, and</w:t>
       </w:r>
       <w:r>
         <w:t xml:space="preserve"> </w:t>
@@ -4621,17 +4709,53 @@
         <w:t xml:space="preserve"> </w:t>
       </w:r>
       <w:r>
-        <w:t xml:space="preserve">so any</w:t>
-      </w:r>
-      <w:r>
-        <w:t xml:space="preserve"> </w:t>
-      </w:r>
-      <w:r>
-        <w:t xml:space="preserve">future need for it is a one-line change there rather than a discovery during bring-up.</w:t>
+        <w:t xml:space="preserve">lists the DMA without</w:t>
+      </w:r>
+      <w:r>
+        <w:t xml:space="preserve"> </w:t>
+      </w:r>
+      <w:r>
+        <w:rPr>
+          <w:rStyle w:val="VerbatimChar"/>
+        </w:rPr>
+        <w:t xml:space="preserve">bootrom</w:t>
+      </w:r>
+      <w:r>
+        <w:t xml:space="preserve">. Any future need is</w:t>
+      </w:r>
+      <w:r>
+        <w:t xml:space="preserve"> </w:t>
+      </w:r>
+      <w:r>
+        <w:t xml:space="preserve">a change there.</w:t>
+      </w:r>
+      <w:r>
+        <w:t xml:space="preserve"> </w:t>
+      </w:r>
+      <w:r>
+        <w:rPr>
+          <w:iCs/>
+          <w:i/>
+        </w:rPr>
+        <w:t xml:space="preserve">(AHB-6, 2026-10-14: this paragraph said "no Boot ROM path", which read as a</w:t>
+      </w:r>
+      <w:r>
+        <w:rPr>
+          <w:iCs/>
+          <w:i/>
+        </w:rPr>
+        <w:t xml:space="preserve"> </w:t>
+      </w:r>
+      <w:r>
+        <w:rPr>
+          <w:iCs/>
+          <w:i/>
+        </w:rPr>
+        <w:t xml:space="preserve">missing wire. Whether the DMA may reach ISRAM is open: DMA-17.)</w:t>
       </w:r>
     </w:p>
     <w:bookmarkEnd w:id="37"/>
-    <w:bookmarkStart w:id="38" w:name="address-decode"/>
+    <w:bookmarkStart w:id="38" w:name="X72a62a7cd5571bbf641e9f4fa40332fb4bf14c4"/>
     <w:p>
       <w:pPr>
         <w:pStyle w:val="Heading3"/>
@@ -4998,7 +5122,7 @@
         <w:t xml:space="preserve"> </w:t>
       </w:r>
       <w:r>
-        <w:t xml:space="preserve">Within a granule, addresses above the slave’s size alias down; the slave</w:t>
+        <w:t xml:space="preserve">Within a granule, addresses above the slave's size alias down; the slave</w:t>
       </w:r>
       <w:r>
         <w:t xml:space="preserve"> </w:t>
@@ -5029,7 +5153,7 @@
       </w:r>
     </w:p>
     <w:bookmarkEnd w:id="38"/>
-    <w:bookmarkStart w:id="39" w:name="sba-indication"/>
+    <w:bookmarkStart w:id="39" w:name="X4d42b57236c70b8cbcc925fbc41571b934d0d8f"/>
     <w:p>
       <w:pPr>
         <w:pStyle w:val="Heading3"/>
@@ -5062,19 +5186,92 @@
         <w:t xml:space="preserve"> </w:t>
       </w:r>
       <w:r>
-        <w:t xml:space="preserve">is asserted whenever the granted master is M2, and is</w:t>
-      </w:r>
-      <w:r>
-        <w:t xml:space="preserve"> </w:t>
-      </w:r>
-      <w:r>
-        <w:t xml:space="preserve">routed to the ISRAM slave only. It carries the grant, registered into the data phase</w:t>
-      </w:r>
-      <w:r>
-        <w:t xml:space="preserve"> </w:t>
-      </w:r>
-      <w:r>
-        <w:t xml:space="preserve">alongside the transfer, so the slave evaluates it in the same cycle as the write.</w:t>
+        <w:t xml:space="preserve">is asserted while the address phase on the shared bus</w:t>
+      </w:r>
+      <w:r>
+        <w:t xml:space="preserve"> </w:t>
+      </w:r>
+      <w:r>
+        <w:t xml:space="preserve">belongs to M2 (the address-phase grant), and is routed to the ISRAM slave only. The ISRAM</w:t>
+      </w:r>
+      <w:r>
+        <w:t xml:space="preserve"> </w:t>
+      </w:r>
+      <w:r>
+        <w:t xml:space="preserve">slave samples it together with the other address-phase signals (HWRITE, HADDR) when it</w:t>
+      </w:r>
+      <w:r>
+        <w:t xml:space="preserve"> </w:t>
+      </w:r>
+      <w:r>
+        <w:t xml:space="preserve">accepts the transfer, and registers the lock decision into its data phase.</w:t>
+      </w:r>
+      <w:r>
+        <w:t xml:space="preserve"> </w:t>
+      </w:r>
+      <w:r>
+        <w:rPr>
+          <w:iCs/>
+          <w:i/>
+        </w:rPr>
+        <w:t xml:space="preserve">(AHB-6, 2026-10-14: this paragraph said the indication is "registered into the data</w:t>
+      </w:r>
+      <w:r>
+        <w:rPr>
+          <w:iCs/>
+          <w:i/>
+        </w:rPr>
+        <w:t xml:space="preserve"> </w:t>
+      </w:r>
+      <w:r>
+        <w:rPr>
+          <w:iCs/>
+          <w:i/>
+        </w:rPr>
+        <w:t xml:space="preserve">phase"; the RTL drives it from the address-phase grant and</w:t>
+      </w:r>
+      <w:r>
+        <w:rPr>
+          <w:iCs/>
+          <w:i/>
+        </w:rPr>
+        <w:t xml:space="preserve"> </w:t>
+      </w:r>
+      <w:r>
+        <w:rPr>
+          <w:rStyle w:val="VerbatimChar"/>
+          <w:iCs/>
+          <w:i/>
+        </w:rPr>
+        <w:t xml:space="preserve">ahb_mem_slave_if.v</w:t>
+      </w:r>
+      <w:r>
+        <w:rPr>
+          <w:iCs/>
+          <w:i/>
+        </w:rPr>
+        <w:t xml:space="preserve"> </w:t>
+      </w:r>
+      <w:r>
+        <w:rPr>
+          <w:iCs/>
+          <w:i/>
+        </w:rPr>
+        <w:t xml:space="preserve">uses it in</w:t>
+      </w:r>
+      <w:r>
+        <w:rPr>
+          <w:iCs/>
+          <w:i/>
+        </w:rPr>
+        <w:t xml:space="preserve"> </w:t>
+      </w:r>
+      <w:r>
+        <w:rPr>
+          <w:iCs/>
+          <w:i/>
+        </w:rPr>
+        <w:t xml:space="preserve">the address phase, consistently. Checked by property a_sba_ind.)</w:t>
       </w:r>
     </w:p>
     <w:p>
@@ -5117,7 +5314,7 @@
       </w:r>
     </w:p>
     <w:bookmarkEnd w:id="39"/>
-    <w:bookmarkStart w:id="40" w:name="error-response"/>
+    <w:bookmarkStart w:id="40" w:name="X0c044dfb93be91006da101596c3edc419f5f74a"/>
     <w:p>
       <w:pPr>
         <w:pStyle w:val="Heading3"/>
@@ -5237,7 +5434,7 @@
         <w:t xml:space="preserve"> </w:t>
       </w:r>
       <w:r>
-        <w:t xml:space="preserve">channel’s error status and raises its error interrupt. The SBA sets</w:t>
+        <w:t xml:space="preserve">channel's error status and raises its error interrupt. The SBA sets</w:t>
       </w:r>
       <w:r>
         <w:t xml:space="preserve"> </w:t>
@@ -5322,7 +5519,7 @@
       </w:r>
     </w:p>
     <w:bookmarkEnd w:id="40"/>
-    <w:bookmarkStart w:id="41" w:name="wait-states"/>
+    <w:bookmarkStart w:id="41" w:name="X22d07c5f7268d0e504a5696923073859dbeecc8"/>
     <w:p>
       <w:pPr>
         <w:pStyle w:val="Heading3"/>
@@ -5367,7 +5564,7 @@
         <w:t xml:space="preserve"> </w:t>
       </w:r>
       <w:r>
-        <w:t xml:space="preserve">is the selected slave’s</w:t>
+        <w:t xml:space="preserve">is the selected slave's</w:t>
       </w:r>
       <w:r>
         <w:t xml:space="preserve"> </w:t>
@@ -5442,7 +5639,7 @@
     </w:p>
     <w:bookmarkEnd w:id="41"/>
     <w:bookmarkEnd w:id="42"/>
-    <w:bookmarkStart w:id="47" w:name="timing"/>
+    <w:bookmarkStart w:id="47" w:name="Xaccd823957f7d6a3a504e6ec5042401faeeed45"/>
     <w:p>
       <w:pPr>
         <w:pStyle w:val="Heading2"/>
@@ -5451,7 +5648,7 @@
         <w:t xml:space="preserve">8 Timing</w:t>
       </w:r>
     </w:p>
-    <w:bookmarkStart w:id="43" w:name="Xc3706fbf2a5f0ba4070ab34dd45d72636709e16"/>
+    <w:bookmarkStart w:id="43" w:name="Xe824deb8ff9a319a019117d45fa2bac898970b0"/>
     <w:p>
       <w:pPr>
         <w:pStyle w:val="Heading3"/>
@@ -5553,7 +5750,7 @@
       </w:r>
     </w:p>
     <w:bookmarkEnd w:id="43"/>
-    <w:bookmarkStart w:id="44" w:name="contention-dma-preempts-an-i-port-burst"/>
+    <w:bookmarkStart w:id="44" w:name="X443d15803cf7d2a4abbd1da3af4908df665fb4a"/>
     <w:p>
       <w:pPr>
         <w:pStyle w:val="Heading3"/>
@@ -5691,7 +5888,7 @@
       </w:r>
     </w:p>
     <w:bookmarkEnd w:id="44"/>
-    <w:bookmarkStart w:id="45" w:name="undecoded-address-two-cycle-error"/>
+    <w:bookmarkStart w:id="45" w:name="X6445af396e70641e2b4e301131cfdc0b7fa1ef4"/>
     <w:p>
       <w:pPr>
         <w:pStyle w:val="Heading3"/>
@@ -5796,7 +5993,7 @@
       </w:r>
     </w:p>
     <w:bookmarkEnd w:id="45"/>
-    <w:bookmarkStart w:id="46" w:name="isram-write-with-the-lock-set"/>
+    <w:bookmarkStart w:id="46" w:name="X3872ed48d530ec9caee3d42f4393ea83a408f58"/>
     <w:p>
       <w:pPr>
         <w:pStyle w:val="Heading3"/>
@@ -5968,7 +6165,7 @@
     </w:p>
     <w:bookmarkEnd w:id="46"/>
     <w:bookmarkEnd w:id="47"/>
-    <w:bookmarkStart w:id="48" w:name="clock-reset-and-power"/>
+    <w:bookmarkStart w:id="48" w:name="X972733491b067ed0fa9a9862bf68234c05bd95b"/>
     <w:p>
       <w:pPr>
         <w:pStyle w:val="Heading2"/>
@@ -6115,7 +6312,7 @@
         <w:t xml:space="preserve"> </w:t>
       </w:r>
       <w:r>
-        <w:t xml:space="preserve">is high, so an ungranted master’s first request is accepted immediately rather</w:t>
+        <w:t xml:space="preserve">is high, so an ungranted master's first request is accepted immediately rather</w:t>
       </w:r>
       <w:r>
         <w:t xml:space="preserve"> </w:t>
@@ -6139,7 +6336,7 @@
         <w:t xml:space="preserve"> </w:t>
       </w:r>
       <w:r>
-        <w:t xml:space="preserve">Power: the interconnect is combinational apart from the arbiter’s grant</w:t>
+        <w:t xml:space="preserve">Power: the interconnect is combinational apart from the arbiter's grant</w:t>
       </w:r>
       <w:r>
         <w:t xml:space="preserve"> </w:t>
@@ -6168,7 +6365,7 @@
       </w:r>
     </w:p>
     <w:bookmarkEnd w:id="48"/>
-    <w:bookmarkStart w:id="49" w:name="assertions"/>
+    <w:bookmarkStart w:id="49" w:name="X80dcce1fe51588c653d94ff32f780f3b44b607a"/>
     <w:p>
       <w:pPr>
         <w:pStyle w:val="Heading2"/>
@@ -7783,7 +7980,7 @@
       </w:r>
     </w:p>
     <w:bookmarkEnd w:id="49"/>
-    <w:bookmarkStart w:id="50" w:name="verification-plan"/>
+    <w:bookmarkStart w:id="50" w:name="X7c07a5b179cc8ff504630894f7928110af6ce23"/>
     <w:p>
       <w:pPr>
         <w:pStyle w:val="Heading2"/>
@@ -7795,7 +7992,7 @@
     <w:tbl>
       <w:tblPr>
         <w:tblStyle w:val="Table"/>
-        <w:tblW w:type="pct" w:w="5000"/>
+        <w:tblW w:type="auto" w:w="0"/>
         <w:tblLook w:firstRow="1" w:lastRow="0" w:firstColumn="0" w:lastColumn="0" w:noHBand="0" w:noVBand="0" w:val="0020"/>
         <w:jc w:val="start"/>
       </w:tblPr>
@@ -8694,7 +8891,7 @@
         <w:t xml:space="preserve"> </w:t>
       </w:r>
       <w:r>
-        <w:t xml:space="preserve">three masters with zero protocol violations. Rev 4.0’s incremental verification burden is</w:t>
+        <w:t xml:space="preserve">three masters with zero protocol violations. Rev 4.0's incremental verification burden is</w:t>
       </w:r>
       <w:r>
         <w:t xml:space="preserve"> </w:t>
@@ -8726,7 +8923,7 @@
       </w:r>
     </w:p>
     <w:bookmarkEnd w:id="50"/>
-    <w:bookmarkStart w:id="51" w:name="design-decisions"/>
+    <w:bookmarkStart w:id="51" w:name="X59f5cce7eef127036c20cabc8986d1f4e77c1bc"/>
     <w:p>
       <w:pPr>
         <w:pStyle w:val="Heading2"/>
@@ -8738,7 +8935,7 @@
     <w:tbl>
       <w:tblPr>
         <w:tblStyle w:val="Table"/>
-        <w:tblW w:type="pct" w:w="5000"/>
+        <w:tblW w:type="auto" w:w="0"/>
         <w:tblLook w:firstRow="1" w:lastRow="0" w:firstColumn="0" w:lastColumn="0" w:noHBand="0" w:noVBand="0" w:val="0020"/>
         <w:jc w:val="start"/>
       </w:tblPr>
@@ -8897,7 +9094,7 @@
       </w:r>
     </w:p>
     <w:bookmarkEnd w:id="51"/>
-    <w:bookmarkStart w:id="52" w:name="not-implemented"/>
+    <w:bookmarkStart w:id="52" w:name="X28f9a372160e4cdd897fa6b3a066b04db81ebc8"/>
     <w:p>
       <w:pPr>
         <w:pStyle w:val="Heading2"/>
@@ -8909,7 +9106,7 @@
     <w:tbl>
       <w:tblPr>
         <w:tblStyle w:val="Table"/>
-        <w:tblW w:type="pct" w:w="5000"/>
+        <w:tblW w:type="auto" w:w="0"/>
         <w:tblLook w:firstRow="1" w:lastRow="0" w:firstColumn="0" w:lastColumn="0" w:noHBand="0" w:noVBand="0" w:val="0020"/>
         <w:jc w:val="start"/>
       </w:tblPr>
@@ -9216,7 +9413,7 @@
       </w:r>
     </w:p>
     <w:bookmarkEnd w:id="52"/>
-    <w:bookmarkStart w:id="53" w:name="open-items"/>
+    <w:bookmarkStart w:id="53" w:name="X1b92181afb94626b64dde4a1928e66f4dbfaa1b"/>
     <w:p>
       <w:pPr>
         <w:pStyle w:val="Heading2"/>
@@ -9241,7 +9438,7 @@
       </w:r>
     </w:p>
     <w:bookmarkEnd w:id="53"/>
-    <w:bookmarkStart w:id="54" w:name="errata"/>
+    <w:bookmarkStart w:id="54" w:name="Xcf6ad7b8070c666514712df471d6381a14b1a48"/>
     <w:p>
       <w:pPr>
         <w:pStyle w:val="Heading2"/>
@@ -9265,7 +9462,7 @@
     <w:tbl>
       <w:tblPr>
         <w:tblStyle w:val="Table"/>
-        <w:tblW w:type="pct" w:w="5000"/>
+        <w:tblW w:type="auto" w:w="0"/>
         <w:tblLook w:firstRow="1" w:lastRow="0" w:firstColumn="0" w:lastColumn="0" w:noHBand="0" w:noVBand="0" w:val="0020"/>
         <w:jc w:val="start"/>
       </w:tblPr>
@@ -9499,7 +9696,7 @@
     <w:tbl>
       <w:tblPr>
         <w:tblStyle w:val="Table"/>
-        <w:tblW w:type="pct" w:w="5000"/>
+        <w:tblW w:type="auto" w:w="0"/>
         <w:tblLook w:firstRow="1" w:lastRow="0" w:firstColumn="0" w:lastColumn="0" w:noHBand="0" w:noVBand="0" w:val="0020"/>
         <w:jc w:val="start"/>
       </w:tblPr>
@@ -9663,7 +9860,7 @@
               <w:jc w:val="left"/>
             </w:pPr>
             <w:r>
-              <w:t xml:space="preserve">A dedicated DMA→ISRAM path was added to work around B-3’s boot problem.</w:t>
+              <w:t xml:space="preserve">A dedicated DMA→ISRAM path was added to work around B-3's boot problem.</w:t>
             </w:r>
           </w:p>
         </w:tc>
@@ -10351,6 +10548,18 @@
     <w:uiPriority w:val="9"/>
     <w:unhideWhenUsed/>
     <w:qFormat/>
+  </w:style>
+  <w:style w:styleId="FootnoteBlockText" w:type="paragraph">
+    <w:name w:val="Footnote Block Text"/>
+    <w:basedOn w:val="Footnote Text"/>
+    <w:next w:val="Footnote Text"/>
+    <w:uiPriority w:val="9"/>
+    <w:unhideWhenUsed/>
+    <w:qFormat/>
+    <w:pPr>
+      <w:spacing w:after="100" w:before="100"/>
+      <w:ind w:firstLine="0" w:left="480" w:right="480"/>
+    </w:pPr>
   </w:style>
   <w:style w:default="1" w:styleId="DefaultParagraphFont" w:type="character">
     <w:name w:val="Default Paragraph Font"/>

</xml_diff>

<commit_message>
AHB interconnect and AHB-to-APB bridge verification; APB-2 bridge fix
Properties (ours: rtl/ahb/ahb_ic_props_a.sv, module ahb_ic_props_a, instance u_ahb_props_a; bridge
ahb2apb_sva.sv next to Karthik's ahb2apb_bridge_sva.sv), master agent, environments, unit benches,
planted defects, coverage. APB-2 high-address alias fixed in the bridge. ahb_lite_sram: Karthik's
TB-B3 line kept (same fix as our TB-47). Spec text in conflicts: Karthik's (DOC-1).
</commit_message>
<xml_diff>
--- a/Design_Docs/GARUDA-AHB-SPEC-001.docx
+++ b/Design_Docs/GARUDA-AHB-SPEC-001.docx
@@ -2,7 +2,7 @@
 <file path=word/document.xml><?xml version="1.0" encoding="utf-8"?>
 <w:document xmlns:w="http://schemas.openxmlformats.org/wordprocessingml/2006/main" xmlns:m="http://schemas.openxmlformats.org/officeDocument/2006/math" xmlns:r="http://schemas.openxmlformats.org/officeDocument/2006/relationships" xmlns:o="urn:schemas-microsoft-com:office:office" xmlns:v="urn:schemas-microsoft-com:vml" xmlns:w10="urn:schemas-microsoft-com:office:word" xmlns:a="http://schemas.openxmlformats.org/drawingml/2006/main" xmlns:pic="http://schemas.openxmlformats.org/drawingml/2006/picture" xmlns:wp="http://schemas.openxmlformats.org/drawingml/2006/wordprocessingDrawing">
   <w:body>
-    <w:bookmarkStart w:id="55" w:name="Xf3a5531c523cef9f34a6f8a5c700408d82a2c83"/>
+    <w:bookmarkStart w:id="55" w:name="X1d124a4e01728a42ff3a5039697764b244460f3"/>
     <w:p>
       <w:pPr>
         <w:pStyle w:val="Heading1"/>
@@ -11,7 +11,7 @@
         <w:t xml:space="preserve">GARUDA AHB-Lite Interconnect — Design Specification</w:t>
       </w:r>
     </w:p>
-    <w:bookmarkStart w:id="20" w:name="identity"/>
+    <w:bookmarkStart w:id="20" w:name="Xee8498aa8c87dd42cd65edb36b9d23d240ee498"/>
     <w:p>
       <w:pPr>
         <w:pStyle w:val="Heading2"/>
@@ -253,7 +253,7 @@
       </w:tr>
     </w:tbl>
     <w:bookmarkEnd w:id="20"/>
-    <w:bookmarkStart w:id="21" w:name="revision-history"/>
+    <w:bookmarkStart w:id="21" w:name="Xb1b59fb676dd662d835fe73b7735d76294c3e07"/>
     <w:p>
       <w:pPr>
         <w:pStyle w:val="Heading2"/>
@@ -265,7 +265,7 @@
     <w:tbl>
       <w:tblPr>
         <w:tblStyle w:val="Table"/>
-        <w:tblW w:type="pct" w:w="5000"/>
+        <w:tblW w:type="auto" w:w="0"/>
         <w:tblLook w:firstRow="1" w:lastRow="0" w:firstColumn="0" w:lastColumn="0" w:noHBand="0" w:noVBand="0" w:val="0020"/>
         <w:jc w:val="start"/>
       </w:tblPr>
@@ -454,9 +454,47 @@
           </w:p>
         </w:tc>
       </w:tr>
+      <w:tr>
+        <w:tc>
+          <w:tcPr/>
+          <w:p>
+            <w:pPr>
+              <w:pStyle w:val="Compact"/>
+              <w:jc w:val="left"/>
+            </w:pPr>
+            <w:r>
+              <w:t xml:space="preserve">4.0a</w:t>
+            </w:r>
+          </w:p>
+        </w:tc>
+        <w:tc>
+          <w:tcPr/>
+          <w:p>
+            <w:pPr>
+              <w:pStyle w:val="Compact"/>
+              <w:jc w:val="left"/>
+            </w:pPr>
+            <w:r>
+              <w:t xml:space="preserve">Note under §2: the DMA's R-9 restriction lives in the DMA, not in the fabric (Track A task 0.7, 2026-10-12; no change to the interconnect).</w:t>
+            </w:r>
+          </w:p>
+        </w:tc>
+        <w:tc>
+          <w:tcPr/>
+          <w:p>
+            <w:pPr>
+              <w:pStyle w:val="Compact"/>
+              <w:jc w:val="left"/>
+            </w:pPr>
+            <w:r>
+              <w:t xml:space="preserve">AUD-12</w:t>
+            </w:r>
+          </w:p>
+        </w:tc>
+      </w:tr>
     </w:tbl>
     <w:bookmarkEnd w:id="21"/>
-    <w:bookmarkStart w:id="22" w:name="normative-references"/>
+    <w:bookmarkStart w:id="22" w:name="X7d72cd5e2ccd5281d575eeaae2e7a05cbe542e8"/>
     <w:p>
       <w:pPr>
         <w:pStyle w:val="Heading2"/>
@@ -590,7 +628,7 @@
       </w:r>
     </w:p>
     <w:bookmarkEnd w:id="22"/>
-    <w:bookmarkStart w:id="26" w:name="purpose-and-scope"/>
+    <w:bookmarkStart w:id="26" w:name="X4666c8db187a468bd7c4d1efd69e1ca31a62544"/>
     <w:p>
       <w:pPr>
         <w:pStyle w:val="Heading2"/>
@@ -599,7 +637,7 @@
         <w:t xml:space="preserve">1 Purpose and scope</w:t>
       </w:r>
     </w:p>
-    <w:bookmarkStart w:id="23" w:name="in-scope"/>
+    <w:bookmarkStart w:id="23" w:name="X982033b5eecaea9e0967e965864423587568394"/>
     <w:p>
       <w:pPr>
         <w:pStyle w:val="Heading3"/>
@@ -623,7 +661,7 @@
       </w:r>
     </w:p>
     <w:bookmarkEnd w:id="23"/>
-    <w:bookmarkStart w:id="24" w:name="out-of-scope"/>
+    <w:bookmarkStart w:id="24" w:name="X132851fb01253333d36643f8ae8b0fecae9f6a0"/>
     <w:p>
       <w:pPr>
         <w:pStyle w:val="Heading3"/>
@@ -678,7 +716,7 @@
       </w:r>
     </w:p>
     <w:bookmarkEnd w:id="24"/>
-    <w:bookmarkStart w:id="25" w:name="why-rev-4.0-goes-backwards"/>
+    <w:bookmarkStart w:id="25" w:name="X2a988fb775ea1e9c388fc67d92735012a534e9f"/>
     <w:p>
       <w:pPr>
         <w:pStyle w:val="Heading3"/>
@@ -765,25 +803,7 @@
         <w:t xml:space="preserve"> </w:t>
       </w:r>
       <w:r>
-        <w:t xml:space="preserve">not reach ISRAM or Boot ROM —</w:t>
-      </w:r>
-      <w:r>
-        <w:t xml:space="preserve"> </w:t>
-      </w:r>
-      <w:r>
-        <w:t xml:space="preserve">“</w:t>
-      </w:r>
-      <w:r>
-        <w:t xml:space="preserve">no wire exists in the netlist.</w:t>
-      </w:r>
-      <w:r>
-        <w:t xml:space="preserve">”</w:t>
-      </w:r>
-      <w:r>
-        <w:t xml:space="preserve"> </w:t>
-      </w:r>
-      <w:r>
-        <w:t xml:space="preserve">That restriction silently</w:t>
+        <w:t xml:space="preserve">not reach ISRAM or Boot ROM — "no wire exists in the netlist." That restriction silently</w:t>
       </w:r>
       <w:r>
         <w:t xml:space="preserve"> </w:t>
@@ -795,7 +815,7 @@
     <w:tbl>
       <w:tblPr>
         <w:tblStyle w:val="Table"/>
-        <w:tblW w:type="pct" w:w="5000"/>
+        <w:tblW w:type="auto" w:w="0"/>
         <w:tblLook w:firstRow="1" w:lastRow="0" w:firstColumn="0" w:lastColumn="0" w:noHBand="0" w:noVBand="0" w:val="0020"/>
         <w:jc w:val="start"/>
       </w:tblPr>
@@ -989,7 +1009,7 @@
     </w:p>
     <w:bookmarkEnd w:id="25"/>
     <w:bookmarkEnd w:id="26"/>
-    <w:bookmarkStart w:id="27" w:name="requirements"/>
+    <w:bookmarkStart w:id="27" w:name="X7ac32b3a81e4212c01abd06ff86531ccba71244"/>
     <w:p>
       <w:pPr>
         <w:pStyle w:val="Heading2"/>
@@ -1001,7 +1021,7 @@
     <w:tbl>
       <w:tblPr>
         <w:tblStyle w:val="Table"/>
-        <w:tblW w:type="pct" w:w="5000"/>
+        <w:tblW w:type="auto" w:w="0"/>
         <w:tblLook w:firstRow="1" w:lastRow="0" w:firstColumn="0" w:lastColumn="0" w:noHBand="0" w:noVBand="0" w:val="0020"/>
         <w:jc w:val="start"/>
       </w:tblPr>
@@ -1376,7 +1396,7 @@
               <w:jc w:val="left"/>
             </w:pPr>
             <w:r>
-              <w:t xml:space="preserve">A master’s burst shall not be corrupted by losing arbitration mid-burst.</w:t>
+              <w:t xml:space="preserve">A master's burst shall not be corrupted by losing arbitration mid-burst.</w:t>
             </w:r>
           </w:p>
         </w:tc>
@@ -1395,6 +1415,68 @@
       </w:tr>
     </w:tbl>
     <w:p>
+      <w:pPr>
+        <w:pStyle w:val="BodyText"/>
+      </w:pPr>
+      <w:r>
+        <w:rPr>
+          <w:iCs/>
+          <w:i/>
+        </w:rPr>
+        <w:t xml:space="preserve">(Note, 2026-10-12, AUD-12 item 1: R-4 lets the DMA (M3) address ISRAM and Boot ROM through the</w:t>
+      </w:r>
+      <w:r>
+        <w:rPr>
+          <w:iCs/>
+          <w:i/>
+        </w:rPr>
+        <w:t xml:space="preserve"> </w:t>
+      </w:r>
+      <w:r>
+        <w:rPr>
+          <w:iCs/>
+          <w:i/>
+        </w:rPr>
+        <w:t xml:space="preserve">fabric. The DMA itself refuses such addresses (</w:t>
+      </w:r>
+      <w:r>
+        <w:rPr>
+          <w:rStyle w:val="VerbatimChar"/>
+          <w:iCs/>
+          <w:i/>
+        </w:rPr>
+        <w:t xml:space="preserve">GARUDA-DMA-SPEC-001</w:t>
+      </w:r>
+      <w:r>
+        <w:rPr>
+          <w:iCs/>
+          <w:i/>
+        </w:rPr>
+        <w:t xml:space="preserve"> </w:t>
+      </w:r>
+      <w:r>
+        <w:rPr>
+          <w:iCs/>
+          <w:i/>
+        </w:rPr>
+        <w:t xml:space="preserve">R-9 and [N-7.20],</w:t>
+      </w:r>
+      <w:r>
+        <w:rPr>
+          <w:iCs/>
+          <w:i/>
+        </w:rPr>
+        <w:t xml:space="preserve"> </w:t>
+      </w:r>
+      <w:r>
+        <w:rPr>
+          <w:iCs/>
+          <w:i/>
+        </w:rPr>
+        <w:t xml:space="preserve">DECISIONS D-16), so the restriction lives in the master, not in the interconnect.)</w:t>
+      </w:r>
+    </w:p>
+    <w:p>
       <w:r>
         <w:pict>
           <v:rect style="width:0;height:1.5pt" o:hralign="center" o:hrstd="t" o:hr="t"/>
@@ -1402,7 +1484,7 @@
       </w:r>
     </w:p>
     <w:bookmarkEnd w:id="27"/>
-    <w:bookmarkStart w:id="28" w:name="block-diagram"/>
+    <w:bookmarkStart w:id="28" w:name="X1a7d97650db9c8935e98f54c49fc0d1c2422484"/>
     <w:p>
       <w:pPr>
         <w:pStyle w:val="Heading2"/>
@@ -1736,7 +1818,7 @@
       </w:r>
     </w:p>
     <w:bookmarkEnd w:id="28"/>
-    <w:bookmarkStart w:id="29" w:name="sub-block-inventory"/>
+    <w:bookmarkStart w:id="29" w:name="Xebf6fc5ba8dcde2af88cf555221c19004ccfe53"/>
     <w:p>
       <w:pPr>
         <w:pStyle w:val="Heading2"/>
@@ -1748,7 +1830,7 @@
     <w:tbl>
       <w:tblPr>
         <w:tblStyle w:val="Table"/>
-        <w:tblW w:type="pct" w:w="5000"/>
+        <w:tblW w:type="auto" w:w="0"/>
         <w:tblLook w:firstRow="1" w:lastRow="0" w:firstColumn="0" w:lastColumn="0" w:noHBand="0" w:noVBand="0" w:val="0020"/>
         <w:jc w:val="start"/>
       </w:tblPr>
@@ -2169,7 +2251,7 @@
       </w:r>
     </w:p>
     <w:bookmarkEnd w:id="29"/>
-    <w:bookmarkStart w:id="33" w:name="interfaces"/>
+    <w:bookmarkStart w:id="33" w:name="X1571269831bc8f18807262f96c888bdf754311e"/>
     <w:p>
       <w:pPr>
         <w:pStyle w:val="Heading2"/>
@@ -2178,7 +2260,7 @@
         <w:t xml:space="preserve">5 Interfaces</w:t>
       </w:r>
     </w:p>
-    <w:bookmarkStart w:id="30" w:name="per-master-interface-4"/>
+    <w:bookmarkStart w:id="30" w:name="X3bd137427acbcf620483206575595e3bc930474"/>
     <w:p>
       <w:pPr>
         <w:pStyle w:val="Heading3"/>
@@ -2190,7 +2272,7 @@
     <w:tbl>
       <w:tblPr>
         <w:tblStyle w:val="Table"/>
-        <w:tblW w:type="pct" w:w="5000"/>
+        <w:tblW w:type="auto" w:w="0"/>
         <w:tblLook w:firstRow="1" w:lastRow="0" w:firstColumn="0" w:lastColumn="0" w:noHBand="0" w:noVBand="0" w:val="0020"/>
         <w:jc w:val="start"/>
       </w:tblPr>
@@ -2866,7 +2948,7 @@
       </w:r>
     </w:p>
     <w:bookmarkEnd w:id="30"/>
-    <w:bookmarkStart w:id="31" w:name="per-slave-interface-4"/>
+    <w:bookmarkStart w:id="31" w:name="Xc1e0cda6f4257969840443f0acc30626bf62d6a"/>
     <w:p>
       <w:pPr>
         <w:pStyle w:val="Heading3"/>
@@ -2878,7 +2960,7 @@
     <w:tbl>
       <w:tblPr>
         <w:tblStyle w:val="Table"/>
-        <w:tblW w:type="pct" w:w="5000"/>
+        <w:tblW w:type="auto" w:w="0"/>
         <w:tblLook w:firstRow="1" w:lastRow="0" w:firstColumn="0" w:lastColumn="0" w:noHBand="0" w:noVBand="0" w:val="0020"/>
         <w:jc w:val="start"/>
       </w:tblPr>
@@ -3155,7 +3237,7 @@
               <w:jc w:val="left"/>
             </w:pPr>
             <w:r>
-              <w:t xml:space="preserve">To ISRAM only. See [N-7.10].</w:t>
+              <w:t xml:space="preserve">To ISRAM only. See [N-7.14].</w:t>
             </w:r>
           </w:p>
         </w:tc>
@@ -3309,7 +3391,7 @@
       </w:tr>
     </w:tbl>
     <w:bookmarkEnd w:id="31"/>
-    <w:bookmarkStart w:id="32" w:name="signals-not-implemented"/>
+    <w:bookmarkStart w:id="32" w:name="X339f1f8c71a749148fadefc78771b4d072571ff"/>
     <w:p>
       <w:pPr>
         <w:pStyle w:val="Heading3"/>
@@ -3417,7 +3499,7 @@
         <w:t xml:space="preserve"> </w:t>
       </w:r>
       <w:r>
-        <w:t xml:space="preserve">single-hart with no atomics (no A extension), and the DMA’s transfers are independent</w:t>
+        <w:t xml:space="preserve">single-hart with no atomics (no A extension), and the DMA's transfers are independent</w:t>
       </w:r>
       <w:r>
         <w:t xml:space="preserve"> </w:t>
@@ -3480,7 +3562,7 @@
     </w:p>
     <w:bookmarkEnd w:id="32"/>
     <w:bookmarkEnd w:id="33"/>
-    <w:bookmarkStart w:id="34" w:name="register-map"/>
+    <w:bookmarkStart w:id="34" w:name="X993360f134ac5f4020b563a2e981249bc87d383"/>
     <w:p>
       <w:pPr>
         <w:pStyle w:val="Heading2"/>
@@ -3533,7 +3615,7 @@
       </w:r>
     </w:p>
     <w:bookmarkEnd w:id="34"/>
-    <w:bookmarkStart w:id="42" w:name="functional-description"/>
+    <w:bookmarkStart w:id="42" w:name="X43b40caff11aa9e2dfba708922741378dc13e92"/>
     <w:p>
       <w:pPr>
         <w:pStyle w:val="Heading2"/>
@@ -3542,7 +3624,7 @@
         <w:t xml:space="preserve">7 Functional description</w:t>
       </w:r>
     </w:p>
-    <w:bookmarkStart w:id="35" w:name="topology"/>
+    <w:bookmarkStart w:id="35" w:name="Xb762d2afbd837307a58a4710d60cd02136ab466"/>
     <w:p>
       <w:pPr>
         <w:pStyle w:val="Heading3"/>
@@ -3627,7 +3709,7 @@
       </w:r>
     </w:p>
     <w:bookmarkEnd w:id="35"/>
-    <w:bookmarkStart w:id="36" w:name="arbitration"/>
+    <w:bookmarkStart w:id="36" w:name="X13fdfd2237080636ca4fd7c2f9ead5398efcef3"/>
     <w:p>
       <w:pPr>
         <w:pStyle w:val="Heading3"/>
@@ -3678,7 +3760,7 @@
     <w:tbl>
       <w:tblPr>
         <w:tblStyle w:val="Table"/>
-        <w:tblW w:type="pct" w:w="5000"/>
+        <w:tblW w:type="auto" w:w="0"/>
         <w:tblLook w:firstRow="1" w:lastRow="0" w:firstColumn="0" w:lastColumn="0" w:noHBand="0" w:noVBand="0" w:val="0020"/>
         <w:jc w:val="start"/>
       </w:tblPr>
@@ -3998,13 +4080,13 @@
         <w:t xml:space="preserve"> </w:t>
       </w:r>
       <w:r>
-        <w:t xml:space="preserve">Once a transfer’s address</w:t>
-      </w:r>
-      <w:r>
-        <w:t xml:space="preserve"> </w:t>
-      </w:r>
-      <w:r>
-        <w:t xml:space="preserve">phase has been accepted, the grant cannot move until that transfer’s data phase completes.</w:t>
+        <w:t xml:space="preserve">Once a transfer's address</w:t>
+      </w:r>
+      <w:r>
+        <w:t xml:space="preserve"> </w:t>
+      </w:r>
+      <w:r>
+        <w:t xml:space="preserve">phase has been accepted, the grant cannot move until that transfer's data phase completes.</w:t>
       </w:r>
       <w:r>
         <w:t xml:space="preserve"> </w:t>
@@ -4046,7 +4128,7 @@
         <w:t xml:space="preserve"> </w:t>
       </w:r>
       <w:r>
-        <w:t xml:space="preserve">The interposed beat completes, then M0’s burst resumes with</w:t>
+        <w:t xml:space="preserve">The interposed beat completes, then M0's burst resumes with</w:t>
       </w:r>
       <w:r>
         <w:t xml:space="preserve"> </w:t>
@@ -4079,7 +4161,7 @@
         <w:t xml:space="preserve">SEQ</w:t>
       </w:r>
       <w:r>
-        <w:t xml:space="preserve">. M0’s prefetch buffer treats a NONSEQ restart as a normal fetch, so</w:t>
+        <w:t xml:space="preserve">. M0's prefetch buffer treats a NONSEQ restart as a normal fetch, so</w:t>
       </w:r>
       <w:r>
         <w:t xml:space="preserve"> </w:t>
@@ -4131,7 +4213,7 @@
       </w:r>
     </w:p>
     <w:bookmarkEnd w:id="36"/>
-    <w:bookmarkStart w:id="37" w:name="reachability-normative"/>
+    <w:bookmarkStart w:id="37" w:name="X58e58b544020298f1942449bda585d06a054e3b"/>
     <w:p>
       <w:pPr>
         <w:pStyle w:val="Heading3"/>
@@ -4528,7 +4610,7 @@
         <w:t xml:space="preserve"> </w:t>
       </w:r>
       <w:r>
-        <w:t xml:space="preserve">decode, (b) the ISRAM write lock, and (c) a slave’s own rejection of an operation it does not</w:t>
+        <w:t xml:space="preserve">decode, (b) the ISRAM write lock, and (c) a slave's own rejection of an operation it does not</w:t>
       </w:r>
       <w:r>
         <w:t xml:space="preserve"> </w:t>
@@ -4594,19 +4676,25 @@
         <w:t xml:space="preserve"> </w:t>
       </w:r>
       <w:r>
-        <w:t xml:space="preserve">M3 (DMA) has no Boot ROM path because nothing requires it: the bootloader is</w:t>
-      </w:r>
-      <w:r>
-        <w:t xml:space="preserve"> </w:t>
-      </w:r>
-      <w:r>
-        <w:t xml:space="preserve">polled PIO (ADR-0015) and no runtime function reads the ROM. This is an omission of an</w:t>
-      </w:r>
-      <w:r>
-        <w:t xml:space="preserve"> </w:t>
-      </w:r>
-      <w:r>
-        <w:t xml:space="preserve">unused path, not an access-control mechanism, and it is recorded in</w:t>
+        <w:t xml:space="preserve">M3 (DMA) does not address the Boot ROM because nothing requires it: the</w:t>
+      </w:r>
+      <w:r>
+        <w:t xml:space="preserve"> </w:t>
+      </w:r>
+      <w:r>
+        <w:t xml:space="preserve">bootloader is polled PIO (ADR-0015) and no runtime function reads the ROM. The fabric path</w:t>
+      </w:r>
+      <w:r>
+        <w:t xml:space="preserve"> </w:t>
+      </w:r>
+      <w:r>
+        <w:t xml:space="preserve">exists (one shared layer, [N-7.9]); the DMA's own address check (GARUDA-DMA-SPEC-001 R-9)</w:t>
+      </w:r>
+      <w:r>
+        <w:t xml:space="preserve"> </w:t>
+      </w:r>
+      <w:r>
+        <w:t xml:space="preserve">refuses region 0x1, and</w:t>
       </w:r>
       <w:r>
         <w:t xml:space="preserve"> </w:t>
@@ -4621,17 +4709,53 @@
         <w:t xml:space="preserve"> </w:t>
       </w:r>
       <w:r>
-        <w:t xml:space="preserve">so any</w:t>
-      </w:r>
-      <w:r>
-        <w:t xml:space="preserve"> </w:t>
-      </w:r>
-      <w:r>
-        <w:t xml:space="preserve">future need for it is a one-line change there rather than a discovery during bring-up.</w:t>
+        <w:t xml:space="preserve">lists the DMA without</w:t>
+      </w:r>
+      <w:r>
+        <w:t xml:space="preserve"> </w:t>
+      </w:r>
+      <w:r>
+        <w:rPr>
+          <w:rStyle w:val="VerbatimChar"/>
+        </w:rPr>
+        <w:t xml:space="preserve">bootrom</w:t>
+      </w:r>
+      <w:r>
+        <w:t xml:space="preserve">. Any future need is</w:t>
+      </w:r>
+      <w:r>
+        <w:t xml:space="preserve"> </w:t>
+      </w:r>
+      <w:r>
+        <w:t xml:space="preserve">a change there.</w:t>
+      </w:r>
+      <w:r>
+        <w:t xml:space="preserve"> </w:t>
+      </w:r>
+      <w:r>
+        <w:rPr>
+          <w:iCs/>
+          <w:i/>
+        </w:rPr>
+        <w:t xml:space="preserve">(AHB-6, 2026-10-14: this paragraph said "no Boot ROM path", which read as a</w:t>
+      </w:r>
+      <w:r>
+        <w:rPr>
+          <w:iCs/>
+          <w:i/>
+        </w:rPr>
+        <w:t xml:space="preserve"> </w:t>
+      </w:r>
+      <w:r>
+        <w:rPr>
+          <w:iCs/>
+          <w:i/>
+        </w:rPr>
+        <w:t xml:space="preserve">missing wire. Whether the DMA may reach ISRAM is open: DMA-17.)</w:t>
       </w:r>
     </w:p>
     <w:bookmarkEnd w:id="37"/>
-    <w:bookmarkStart w:id="38" w:name="address-decode"/>
+    <w:bookmarkStart w:id="38" w:name="X72a62a7cd5571bbf641e9f4fa40332fb4bf14c4"/>
     <w:p>
       <w:pPr>
         <w:pStyle w:val="Heading3"/>
@@ -4998,7 +5122,7 @@
         <w:t xml:space="preserve"> </w:t>
       </w:r>
       <w:r>
-        <w:t xml:space="preserve">Within a granule, addresses above the slave’s size alias down; the slave</w:t>
+        <w:t xml:space="preserve">Within a granule, addresses above the slave's size alias down; the slave</w:t>
       </w:r>
       <w:r>
         <w:t xml:space="preserve"> </w:t>
@@ -5029,7 +5153,7 @@
       </w:r>
     </w:p>
     <w:bookmarkEnd w:id="38"/>
-    <w:bookmarkStart w:id="39" w:name="sba-indication"/>
+    <w:bookmarkStart w:id="39" w:name="X4d42b57236c70b8cbcc925fbc41571b934d0d8f"/>
     <w:p>
       <w:pPr>
         <w:pStyle w:val="Heading3"/>
@@ -5062,19 +5186,92 @@
         <w:t xml:space="preserve"> </w:t>
       </w:r>
       <w:r>
-        <w:t xml:space="preserve">is asserted whenever the granted master is M2, and is</w:t>
-      </w:r>
-      <w:r>
-        <w:t xml:space="preserve"> </w:t>
-      </w:r>
-      <w:r>
-        <w:t xml:space="preserve">routed to the ISRAM slave only. It carries the grant, registered into the data phase</w:t>
-      </w:r>
-      <w:r>
-        <w:t xml:space="preserve"> </w:t>
-      </w:r>
-      <w:r>
-        <w:t xml:space="preserve">alongside the transfer, so the slave evaluates it in the same cycle as the write.</w:t>
+        <w:t xml:space="preserve">is asserted while the address phase on the shared bus</w:t>
+      </w:r>
+      <w:r>
+        <w:t xml:space="preserve"> </w:t>
+      </w:r>
+      <w:r>
+        <w:t xml:space="preserve">belongs to M2 (the address-phase grant), and is routed to the ISRAM slave only. The ISRAM</w:t>
+      </w:r>
+      <w:r>
+        <w:t xml:space="preserve"> </w:t>
+      </w:r>
+      <w:r>
+        <w:t xml:space="preserve">slave samples it together with the other address-phase signals (HWRITE, HADDR) when it</w:t>
+      </w:r>
+      <w:r>
+        <w:t xml:space="preserve"> </w:t>
+      </w:r>
+      <w:r>
+        <w:t xml:space="preserve">accepts the transfer, and registers the lock decision into its data phase.</w:t>
+      </w:r>
+      <w:r>
+        <w:t xml:space="preserve"> </w:t>
+      </w:r>
+      <w:r>
+        <w:rPr>
+          <w:iCs/>
+          <w:i/>
+        </w:rPr>
+        <w:t xml:space="preserve">(AHB-6, 2026-10-14: this paragraph said the indication is "registered into the data</w:t>
+      </w:r>
+      <w:r>
+        <w:rPr>
+          <w:iCs/>
+          <w:i/>
+        </w:rPr>
+        <w:t xml:space="preserve"> </w:t>
+      </w:r>
+      <w:r>
+        <w:rPr>
+          <w:iCs/>
+          <w:i/>
+        </w:rPr>
+        <w:t xml:space="preserve">phase"; the RTL drives it from the address-phase grant and</w:t>
+      </w:r>
+      <w:r>
+        <w:rPr>
+          <w:iCs/>
+          <w:i/>
+        </w:rPr>
+        <w:t xml:space="preserve"> </w:t>
+      </w:r>
+      <w:r>
+        <w:rPr>
+          <w:rStyle w:val="VerbatimChar"/>
+          <w:iCs/>
+          <w:i/>
+        </w:rPr>
+        <w:t xml:space="preserve">ahb_mem_slave_if.v</w:t>
+      </w:r>
+      <w:r>
+        <w:rPr>
+          <w:iCs/>
+          <w:i/>
+        </w:rPr>
+        <w:t xml:space="preserve"> </w:t>
+      </w:r>
+      <w:r>
+        <w:rPr>
+          <w:iCs/>
+          <w:i/>
+        </w:rPr>
+        <w:t xml:space="preserve">uses it in</w:t>
+      </w:r>
+      <w:r>
+        <w:rPr>
+          <w:iCs/>
+          <w:i/>
+        </w:rPr>
+        <w:t xml:space="preserve"> </w:t>
+      </w:r>
+      <w:r>
+        <w:rPr>
+          <w:iCs/>
+          <w:i/>
+        </w:rPr>
+        <w:t xml:space="preserve">the address phase, consistently. Checked by property a_sba_ind.)</w:t>
       </w:r>
     </w:p>
     <w:p>
@@ -5117,7 +5314,7 @@
       </w:r>
     </w:p>
     <w:bookmarkEnd w:id="39"/>
-    <w:bookmarkStart w:id="40" w:name="error-response"/>
+    <w:bookmarkStart w:id="40" w:name="X0c044dfb93be91006da101596c3edc419f5f74a"/>
     <w:p>
       <w:pPr>
         <w:pStyle w:val="Heading3"/>
@@ -5237,7 +5434,7 @@
         <w:t xml:space="preserve"> </w:t>
       </w:r>
       <w:r>
-        <w:t xml:space="preserve">channel’s error status and raises its error interrupt. The SBA sets</w:t>
+        <w:t xml:space="preserve">channel's error status and raises its error interrupt. The SBA sets</w:t>
       </w:r>
       <w:r>
         <w:t xml:space="preserve"> </w:t>
@@ -5322,7 +5519,7 @@
       </w:r>
     </w:p>
     <w:bookmarkEnd w:id="40"/>
-    <w:bookmarkStart w:id="41" w:name="wait-states"/>
+    <w:bookmarkStart w:id="41" w:name="X22d07c5f7268d0e504a5696923073859dbeecc8"/>
     <w:p>
       <w:pPr>
         <w:pStyle w:val="Heading3"/>
@@ -5367,7 +5564,7 @@
         <w:t xml:space="preserve"> </w:t>
       </w:r>
       <w:r>
-        <w:t xml:space="preserve">is the selected slave’s</w:t>
+        <w:t xml:space="preserve">is the selected slave's</w:t>
       </w:r>
       <w:r>
         <w:t xml:space="preserve"> </w:t>
@@ -5442,7 +5639,7 @@
     </w:p>
     <w:bookmarkEnd w:id="41"/>
     <w:bookmarkEnd w:id="42"/>
-    <w:bookmarkStart w:id="47" w:name="timing"/>
+    <w:bookmarkStart w:id="47" w:name="Xaccd823957f7d6a3a504e6ec5042401faeeed45"/>
     <w:p>
       <w:pPr>
         <w:pStyle w:val="Heading2"/>
@@ -5451,7 +5648,7 @@
         <w:t xml:space="preserve">8 Timing</w:t>
       </w:r>
     </w:p>
-    <w:bookmarkStart w:id="43" w:name="Xc3706fbf2a5f0ba4070ab34dd45d72636709e16"/>
+    <w:bookmarkStart w:id="43" w:name="Xe824deb8ff9a319a019117d45fa2bac898970b0"/>
     <w:p>
       <w:pPr>
         <w:pStyle w:val="Heading3"/>
@@ -5553,7 +5750,7 @@
       </w:r>
     </w:p>
     <w:bookmarkEnd w:id="43"/>
-    <w:bookmarkStart w:id="44" w:name="contention-dma-preempts-an-i-port-burst"/>
+    <w:bookmarkStart w:id="44" w:name="X443d15803cf7d2a4abbd1da3af4908df665fb4a"/>
     <w:p>
       <w:pPr>
         <w:pStyle w:val="Heading3"/>
@@ -5691,7 +5888,7 @@
       </w:r>
     </w:p>
     <w:bookmarkEnd w:id="44"/>
-    <w:bookmarkStart w:id="45" w:name="undecoded-address-two-cycle-error"/>
+    <w:bookmarkStart w:id="45" w:name="X6445af396e70641e2b4e301131cfdc0b7fa1ef4"/>
     <w:p>
       <w:pPr>
         <w:pStyle w:val="Heading3"/>
@@ -5796,7 +5993,7 @@
       </w:r>
     </w:p>
     <w:bookmarkEnd w:id="45"/>
-    <w:bookmarkStart w:id="46" w:name="isram-write-with-the-lock-set"/>
+    <w:bookmarkStart w:id="46" w:name="X3872ed48d530ec9caee3d42f4393ea83a408f58"/>
     <w:p>
       <w:pPr>
         <w:pStyle w:val="Heading3"/>
@@ -5968,7 +6165,7 @@
     </w:p>
     <w:bookmarkEnd w:id="46"/>
     <w:bookmarkEnd w:id="47"/>
-    <w:bookmarkStart w:id="48" w:name="clock-reset-and-power"/>
+    <w:bookmarkStart w:id="48" w:name="X972733491b067ed0fa9a9862bf68234c05bd95b"/>
     <w:p>
       <w:pPr>
         <w:pStyle w:val="Heading2"/>
@@ -6115,7 +6312,7 @@
         <w:t xml:space="preserve"> </w:t>
       </w:r>
       <w:r>
-        <w:t xml:space="preserve">is high, so an ungranted master’s first request is accepted immediately rather</w:t>
+        <w:t xml:space="preserve">is high, so an ungranted master's first request is accepted immediately rather</w:t>
       </w:r>
       <w:r>
         <w:t xml:space="preserve"> </w:t>
@@ -6139,7 +6336,7 @@
         <w:t xml:space="preserve"> </w:t>
       </w:r>
       <w:r>
-        <w:t xml:space="preserve">Power: the interconnect is combinational apart from the arbiter’s grant</w:t>
+        <w:t xml:space="preserve">Power: the interconnect is combinational apart from the arbiter's grant</w:t>
       </w:r>
       <w:r>
         <w:t xml:space="preserve"> </w:t>
@@ -6168,7 +6365,7 @@
       </w:r>
     </w:p>
     <w:bookmarkEnd w:id="48"/>
-    <w:bookmarkStart w:id="49" w:name="assertions"/>
+    <w:bookmarkStart w:id="49" w:name="X80dcce1fe51588c653d94ff32f780f3b44b607a"/>
     <w:p>
       <w:pPr>
         <w:pStyle w:val="Heading2"/>
@@ -7783,7 +7980,7 @@
       </w:r>
     </w:p>
     <w:bookmarkEnd w:id="49"/>
-    <w:bookmarkStart w:id="50" w:name="verification-plan"/>
+    <w:bookmarkStart w:id="50" w:name="X7c07a5b179cc8ff504630894f7928110af6ce23"/>
     <w:p>
       <w:pPr>
         <w:pStyle w:val="Heading2"/>
@@ -7795,7 +7992,7 @@
     <w:tbl>
       <w:tblPr>
         <w:tblStyle w:val="Table"/>
-        <w:tblW w:type="pct" w:w="5000"/>
+        <w:tblW w:type="auto" w:w="0"/>
         <w:tblLook w:firstRow="1" w:lastRow="0" w:firstColumn="0" w:lastColumn="0" w:noHBand="0" w:noVBand="0" w:val="0020"/>
         <w:jc w:val="start"/>
       </w:tblPr>
@@ -8694,7 +8891,7 @@
         <w:t xml:space="preserve"> </w:t>
       </w:r>
       <w:r>
-        <w:t xml:space="preserve">three masters with zero protocol violations. Rev 4.0’s incremental verification burden is</w:t>
+        <w:t xml:space="preserve">three masters with zero protocol violations. Rev 4.0's incremental verification burden is</w:t>
       </w:r>
       <w:r>
         <w:t xml:space="preserve"> </w:t>
@@ -8726,7 +8923,7 @@
       </w:r>
     </w:p>
     <w:bookmarkEnd w:id="50"/>
-    <w:bookmarkStart w:id="51" w:name="design-decisions"/>
+    <w:bookmarkStart w:id="51" w:name="X59f5cce7eef127036c20cabc8986d1f4e77c1bc"/>
     <w:p>
       <w:pPr>
         <w:pStyle w:val="Heading2"/>
@@ -8738,7 +8935,7 @@
     <w:tbl>
       <w:tblPr>
         <w:tblStyle w:val="Table"/>
-        <w:tblW w:type="pct" w:w="5000"/>
+        <w:tblW w:type="auto" w:w="0"/>
         <w:tblLook w:firstRow="1" w:lastRow="0" w:firstColumn="0" w:lastColumn="0" w:noHBand="0" w:noVBand="0" w:val="0020"/>
         <w:jc w:val="start"/>
       </w:tblPr>
@@ -8897,7 +9094,7 @@
       </w:r>
     </w:p>
     <w:bookmarkEnd w:id="51"/>
-    <w:bookmarkStart w:id="52" w:name="not-implemented"/>
+    <w:bookmarkStart w:id="52" w:name="X28f9a372160e4cdd897fa6b3a066b04db81ebc8"/>
     <w:p>
       <w:pPr>
         <w:pStyle w:val="Heading2"/>
@@ -8909,7 +9106,7 @@
     <w:tbl>
       <w:tblPr>
         <w:tblStyle w:val="Table"/>
-        <w:tblW w:type="pct" w:w="5000"/>
+        <w:tblW w:type="auto" w:w="0"/>
         <w:tblLook w:firstRow="1" w:lastRow="0" w:firstColumn="0" w:lastColumn="0" w:noHBand="0" w:noVBand="0" w:val="0020"/>
         <w:jc w:val="start"/>
       </w:tblPr>
@@ -9216,7 +9413,7 @@
       </w:r>
     </w:p>
     <w:bookmarkEnd w:id="52"/>
-    <w:bookmarkStart w:id="53" w:name="open-items"/>
+    <w:bookmarkStart w:id="53" w:name="X1b92181afb94626b64dde4a1928e66f4dbfaa1b"/>
     <w:p>
       <w:pPr>
         <w:pStyle w:val="Heading2"/>
@@ -9241,7 +9438,7 @@
       </w:r>
     </w:p>
     <w:bookmarkEnd w:id="53"/>
-    <w:bookmarkStart w:id="54" w:name="errata"/>
+    <w:bookmarkStart w:id="54" w:name="Xcf6ad7b8070c666514712df471d6381a14b1a48"/>
     <w:p>
       <w:pPr>
         <w:pStyle w:val="Heading2"/>
@@ -9265,7 +9462,7 @@
     <w:tbl>
       <w:tblPr>
         <w:tblStyle w:val="Table"/>
-        <w:tblW w:type="pct" w:w="5000"/>
+        <w:tblW w:type="auto" w:w="0"/>
         <w:tblLook w:firstRow="1" w:lastRow="0" w:firstColumn="0" w:lastColumn="0" w:noHBand="0" w:noVBand="0" w:val="0020"/>
         <w:jc w:val="start"/>
       </w:tblPr>
@@ -9499,7 +9696,7 @@
     <w:tbl>
       <w:tblPr>
         <w:tblStyle w:val="Table"/>
-        <w:tblW w:type="pct" w:w="5000"/>
+        <w:tblW w:type="auto" w:w="0"/>
         <w:tblLook w:firstRow="1" w:lastRow="0" w:firstColumn="0" w:lastColumn="0" w:noHBand="0" w:noVBand="0" w:val="0020"/>
         <w:jc w:val="start"/>
       </w:tblPr>
@@ -9663,7 +9860,7 @@
               <w:jc w:val="left"/>
             </w:pPr>
             <w:r>
-              <w:t xml:space="preserve">A dedicated DMA→ISRAM path was added to work around B-3’s boot problem.</w:t>
+              <w:t xml:space="preserve">A dedicated DMA→ISRAM path was added to work around B-3's boot problem.</w:t>
             </w:r>
           </w:p>
         </w:tc>
@@ -10351,6 +10548,18 @@
     <w:uiPriority w:val="9"/>
     <w:unhideWhenUsed/>
     <w:qFormat/>
+  </w:style>
+  <w:style w:styleId="FootnoteBlockText" w:type="paragraph">
+    <w:name w:val="Footnote Block Text"/>
+    <w:basedOn w:val="Footnote Text"/>
+    <w:next w:val="Footnote Text"/>
+    <w:uiPriority w:val="9"/>
+    <w:unhideWhenUsed/>
+    <w:qFormat/>
+    <w:pPr>
+      <w:spacing w:after="100" w:before="100"/>
+      <w:ind w:firstLine="0" w:left="480" w:right="480"/>
+    </w:pPr>
   </w:style>
   <w:style w:default="1" w:styleId="DefaultParagraphFont" w:type="character">
     <w:name w:val="Default Paragraph Font"/>

</xml_diff>